<commit_message>
fix(scrap-docx): Tree Survey Fix (Gen 115) — เพิ่มจอขาด + แก้ mismatch
เพิ่มจอที่ขาด:
- W-13/W-14 Website /listings/scrap (public · in-chain S1) → T1+T13
- A-33/A-33b Admin /scrap/listings (list+detail) → T13
- A-08b Admin Scrap Job Detail (drill-down จาก A-08) → T13
- A-11b Admin E-Waste Cert Detail (S4 detail) → T4+T13

แก้ mismatch (docx↔registry):
- S4: A-11 goto → A-11b /scrap/certificates/[id]
- S2: R-28c+R-28e เพิ่มเป็น decision rows + R-28 goto updated
- A-08 goto → A-08b /scrap/jobs/[id]
- A-11 (T13) goto → A-11b /scrap/certificates/[id]

docx only · no .py committed · rows 110 · cols [9×14] ✅
base: c151e53 (hub-integ-p2p3-v3)

Co-Authored-By: Claude Sonnet 4.6 <noreply@anthropic.com>
</commit_message>
<xml_diff>
--- a/docs/Scrap_Module.docx
+++ b/docs/Scrap_Module.docx
@@ -2171,6 +2171,262 @@
               <w:rPr>
                 <w:sz w:val="16"/>
               </w:rPr>
+              <w:t>W-13</w:t>
+            </w:r>
+          </w:p>
+        </w:tc>
+        <w:tc>
+          <w:tcPr>
+            <w:tcW w:type="dxa" w:w="1984"/>
+            <w:shd w:val="clear" w:color="auto" w:fill="FFF9C4"/>
+          </w:tcPr>
+          <w:p>
+            <w:r>
+              <w:rPr>
+                <w:sz w:val="16"/>
+              </w:rPr>
+              <w:t>รายการซากสาธารณะ (Website)</w:t>
+            </w:r>
+          </w:p>
+        </w:tc>
+        <w:tc>
+          <w:tcPr>
+            <w:tcW w:type="dxa" w:w="1701"/>
+            <w:shd w:val="clear" w:color="auto" w:fill="FFF9C4"/>
+          </w:tcPr>
+          <w:p>
+            <w:r>
+              <w:rPr>
+                <w:sz w:val="16"/>
+              </w:rPr>
+              <w:t>Website navigation</w:t>
+            </w:r>
+          </w:p>
+        </w:tc>
+        <w:tc>
+          <w:tcPr>
+            <w:tcW w:type="dxa" w:w="1984"/>
+            <w:shd w:val="clear" w:color="auto" w:fill="FFF9C4"/>
+          </w:tcPr>
+          <w:p>
+            <w:r>
+              <w:rPr>
+                <w:sz w:val="16"/>
+              </w:rPr>
+              <w:t>Anonymous/ผู้สนใจเปิดดูรายการซากที่วางขาย</w:t>
+            </w:r>
+          </w:p>
+        </w:tc>
+        <w:tc>
+          <w:tcPr>
+            <w:tcW w:type="dxa" w:w="1701"/>
+            <w:shd w:val="clear" w:color="auto" w:fill="FFF9C4"/>
+          </w:tcPr>
+          <w:p>
+            <w:r>
+              <w:rPr>
+                <w:sz w:val="16"/>
+              </w:rPr>
+              <w:t>W-14 /listings/scrap/[id]</w:t>
+            </w:r>
+          </w:p>
+        </w:tc>
+        <w:tc>
+          <w:tcPr>
+            <w:tcW w:type="dxa" w:w="1587"/>
+            <w:shd w:val="clear" w:color="auto" w:fill="FFF9C4"/>
+          </w:tcPr>
+          <w:p>
+            <w:r>
+              <w:rPr>
+                <w:sz w:val="16"/>
+              </w:rPr>
+              <w:t>Website (สาธารณะ)</w:t>
+            </w:r>
+          </w:p>
+        </w:tc>
+        <w:tc>
+          <w:tcPr>
+            <w:tcW w:type="dxa" w:w="567"/>
+            <w:shd w:val="clear" w:color="auto" w:fill="FFF9C4"/>
+          </w:tcPr>
+          <w:p>
+            <w:r>
+              <w:rPr>
+                <w:sz w:val="16"/>
+              </w:rPr>
+              <w:t>S1</w:t>
+            </w:r>
+          </w:p>
+        </w:tc>
+        <w:tc>
+          <w:tcPr>
+            <w:tcW w:type="dxa" w:w="1814"/>
+            <w:shd w:val="clear" w:color="auto" w:fill="FFF9C4"/>
+          </w:tcPr>
+          <w:p>
+            <w:r>
+              <w:rPr>
+                <w:sz w:val="16"/>
+              </w:rPr>
+              <w:t>Public listing · grade/ราคา · no login · in-chain S1</w:t>
+            </w:r>
+          </w:p>
+        </w:tc>
+        <w:tc>
+          <w:tcPr>
+            <w:tcW w:type="dxa" w:w="3118"/>
+            <w:shd w:val="clear" w:color="auto" w:fill="FFF9C4"/>
+          </w:tcPr>
+          <w:p>
+            <w:r>
+              <w:rPr>
+                <w:sz w:val="16"/>
+              </w:rPr>
+              <w:t>http://localhost:3004/listings/scrap</w:t>
+            </w:r>
+          </w:p>
+        </w:tc>
+      </w:tr>
+      <w:tr>
+        <w:tc>
+          <w:tcPr>
+            <w:tcW w:type="dxa" w:w="680"/>
+            <w:shd w:val="clear" w:color="auto" w:fill="FFF9C4"/>
+          </w:tcPr>
+          <w:p>
+            <w:r>
+              <w:rPr>
+                <w:sz w:val="16"/>
+              </w:rPr>
+              <w:t>W-14</w:t>
+            </w:r>
+          </w:p>
+        </w:tc>
+        <w:tc>
+          <w:tcPr>
+            <w:tcW w:type="dxa" w:w="1984"/>
+            <w:shd w:val="clear" w:color="auto" w:fill="FFF9C4"/>
+          </w:tcPr>
+          <w:p>
+            <w:r>
+              <w:rPr>
+                <w:sz w:val="16"/>
+              </w:rPr>
+              <w:t>รายละเอียดซากสาธารณะ (Website)</w:t>
+            </w:r>
+          </w:p>
+        </w:tc>
+        <w:tc>
+          <w:tcPr>
+            <w:tcW w:type="dxa" w:w="1701"/>
+            <w:shd w:val="clear" w:color="auto" w:fill="FFF9C4"/>
+          </w:tcPr>
+          <w:p>
+            <w:r>
+              <w:rPr>
+                <w:sz w:val="16"/>
+              </w:rPr>
+              <w:t>W-13 /listings/scrap</w:t>
+            </w:r>
+          </w:p>
+        </w:tc>
+        <w:tc>
+          <w:tcPr>
+            <w:tcW w:type="dxa" w:w="1984"/>
+            <w:shd w:val="clear" w:color="auto" w:fill="FFF9C4"/>
+          </w:tcPr>
+          <w:p>
+            <w:r>
+              <w:rPr>
+                <w:sz w:val="16"/>
+              </w:rPr>
+              <w:t>เลือกดูรายละเอียดซาก</w:t>
+            </w:r>
+          </w:p>
+        </w:tc>
+        <w:tc>
+          <w:tcPr>
+            <w:tcW w:type="dxa" w:w="1701"/>
+            <w:shd w:val="clear" w:color="auto" w:fill="FFF9C4"/>
+          </w:tcPr>
+          <w:p>
+            <w:r>
+              <w:rPr>
+                <w:sz w:val="16"/>
+              </w:rPr>
+              <w:t>R-78 /scrap/browse/[id] (login as WeeeR)</w:t>
+            </w:r>
+          </w:p>
+        </w:tc>
+        <w:tc>
+          <w:tcPr>
+            <w:tcW w:type="dxa" w:w="1587"/>
+            <w:shd w:val="clear" w:color="auto" w:fill="FFF9C4"/>
+          </w:tcPr>
+          <w:p>
+            <w:r>
+              <w:rPr>
+                <w:sz w:val="16"/>
+              </w:rPr>
+              <w:t>Website (สาธารณะ) · WeeeR</w:t>
+            </w:r>
+          </w:p>
+        </w:tc>
+        <w:tc>
+          <w:tcPr>
+            <w:tcW w:type="dxa" w:w="567"/>
+            <w:shd w:val="clear" w:color="auto" w:fill="FFF9C4"/>
+          </w:tcPr>
+          <w:p>
+            <w:r>
+              <w:rPr>
+                <w:sz w:val="16"/>
+              </w:rPr>
+              <w:t>S1</w:t>
+            </w:r>
+          </w:p>
+        </w:tc>
+        <w:tc>
+          <w:tcPr>
+            <w:tcW w:type="dxa" w:w="1814"/>
+            <w:shd w:val="clear" w:color="auto" w:fill="FFF9C4"/>
+          </w:tcPr>
+          <w:p>
+            <w:r>
+              <w:rPr>
+                <w:sz w:val="16"/>
+              </w:rPr>
+              <w:t>Public detail · 'สนใจรับซาก' → login → R-78</w:t>
+            </w:r>
+          </w:p>
+        </w:tc>
+        <w:tc>
+          <w:tcPr>
+            <w:tcW w:type="dxa" w:w="3118"/>
+            <w:shd w:val="clear" w:color="auto" w:fill="FFF9C4"/>
+          </w:tcPr>
+          <w:p>
+            <w:r>
+              <w:rPr>
+                <w:sz w:val="16"/>
+              </w:rPr>
+              <w:t>http://localhost:3004/listings/scrap/SCR-001</w:t>
+            </w:r>
+          </w:p>
+        </w:tc>
+      </w:tr>
+      <w:tr>
+        <w:tc>
+          <w:tcPr>
+            <w:tcW w:type="dxa" w:w="680"/>
+            <w:shd w:val="clear" w:color="auto" w:fill="FFF9C4"/>
+          </w:tcPr>
+          <w:p>
+            <w:r>
+              <w:rPr>
+                <w:sz w:val="16"/>
+              </w:rPr>
               <w:t>R-70</w:t>
             </w:r>
           </w:p>
@@ -3555,7 +3811,7 @@
               <w:rPr>
                 <w:sz w:val="16"/>
               </w:rPr>
-              <w:t>R-28e /dispose</w:t>
+              <w:t>R-28c (แยกอะไหล่) / R-28e (dispose)</w:t>
             </w:r>
           </w:p>
         </w:tc>
@@ -3612,6 +3868,262 @@
                 <w:sz w:val="16"/>
               </w:rPr>
               <w:t>http://localhost:3001/scrap/jobs</w:t>
+            </w:r>
+          </w:p>
+        </w:tc>
+      </w:tr>
+      <w:tr>
+        <w:tc>
+          <w:tcPr>
+            <w:tcW w:type="dxa" w:w="680"/>
+            <w:shd w:val="clear" w:color="auto" w:fill="E8F5E9"/>
+          </w:tcPr>
+          <w:p>
+            <w:r>
+              <w:rPr>
+                <w:sz w:val="16"/>
+              </w:rPr>
+              <w:t>R-28e</w:t>
+            </w:r>
+          </w:p>
+        </w:tc>
+        <w:tc>
+          <w:tcPr>
+            <w:tcW w:type="dxa" w:w="1984"/>
+            <w:shd w:val="clear" w:color="auto" w:fill="E8F5E9"/>
+          </w:tcPr>
+          <w:p>
+            <w:r>
+              <w:rPr>
+                <w:sz w:val="16"/>
+              </w:rPr>
+              <w:t>ตัดสินใจ: รีไซเคิล/E-Waste</w:t>
+            </w:r>
+          </w:p>
+        </w:tc>
+        <w:tc>
+          <w:tcPr>
+            <w:tcW w:type="dxa" w:w="1701"/>
+            <w:shd w:val="clear" w:color="auto" w:fill="E8F5E9"/>
+          </w:tcPr>
+          <w:p>
+            <w:r>
+              <w:rPr>
+                <w:sz w:val="16"/>
+              </w:rPr>
+              <w:t>R-28</w:t>
+            </w:r>
+          </w:p>
+        </w:tc>
+        <w:tc>
+          <w:tcPr>
+            <w:tcW w:type="dxa" w:w="1984"/>
+            <w:shd w:val="clear" w:color="auto" w:fill="E8F5E9"/>
+          </w:tcPr>
+          <w:p>
+            <w:r>
+              <w:rPr>
+                <w:sz w:val="16"/>
+              </w:rPr>
+              <w:t>S2 เลือก dispose → WeeeR รับซากไปรีไซเคิล (isFree=true)</w:t>
+            </w:r>
+          </w:p>
+        </w:tc>
+        <w:tc>
+          <w:tcPr>
+            <w:tcW w:type="dxa" w:w="1701"/>
+            <w:shd w:val="clear" w:color="auto" w:fill="E8F5E9"/>
+          </w:tcPr>
+          <w:p>
+            <w:r>
+              <w:rPr>
+                <w:sz w:val="16"/>
+              </w:rPr>
+              <w:t>R-27 /scrap/jobs</w:t>
+            </w:r>
+          </w:p>
+        </w:tc>
+        <w:tc>
+          <w:tcPr>
+            <w:tcW w:type="dxa" w:w="1587"/>
+            <w:shd w:val="clear" w:color="auto" w:fill="E8F5E9"/>
+          </w:tcPr>
+          <w:p>
+            <w:r>
+              <w:rPr>
+                <w:sz w:val="16"/>
+              </w:rPr>
+              <w:t>WeeeR</w:t>
+            </w:r>
+          </w:p>
+        </w:tc>
+        <w:tc>
+          <w:tcPr>
+            <w:tcW w:type="dxa" w:w="567"/>
+            <w:shd w:val="clear" w:color="auto" w:fill="E8F5E9"/>
+          </w:tcPr>
+          <w:p>
+            <w:r>
+              <w:rPr>
+                <w:sz w:val="16"/>
+              </w:rPr>
+              <w:t>S2</w:t>
+            </w:r>
+          </w:p>
+        </w:tc>
+        <w:tc>
+          <w:tcPr>
+            <w:tcW w:type="dxa" w:w="1814"/>
+            <w:shd w:val="clear" w:color="auto" w:fill="E8F5E9"/>
+          </w:tcPr>
+          <w:p>
+            <w:r>
+              <w:rPr>
+                <w:sz w:val="16"/>
+              </w:rPr>
+              <w:t>isFree=true dispose · ไม่มีค่าใช้จ่าย</w:t>
+            </w:r>
+          </w:p>
+        </w:tc>
+        <w:tc>
+          <w:tcPr>
+            <w:tcW w:type="dxa" w:w="3118"/>
+            <w:shd w:val="clear" w:color="auto" w:fill="E8F5E9"/>
+          </w:tcPr>
+          <w:p>
+            <w:r>
+              <w:rPr>
+                <w:sz w:val="16"/>
+              </w:rPr>
+              <w:t>http://localhost:3001/scrap/jobs/SJ001/dispose</w:t>
+            </w:r>
+          </w:p>
+        </w:tc>
+      </w:tr>
+      <w:tr>
+        <w:tc>
+          <w:tcPr>
+            <w:tcW w:type="dxa" w:w="680"/>
+            <w:shd w:val="clear" w:color="auto" w:fill="E8F5E9"/>
+          </w:tcPr>
+          <w:p>
+            <w:r>
+              <w:rPr>
+                <w:sz w:val="16"/>
+              </w:rPr>
+              <w:t>R-28c</w:t>
+            </w:r>
+          </w:p>
+        </w:tc>
+        <w:tc>
+          <w:tcPr>
+            <w:tcW w:type="dxa" w:w="1984"/>
+            <w:shd w:val="clear" w:color="auto" w:fill="E8F5E9"/>
+          </w:tcPr>
+          <w:p>
+            <w:r>
+              <w:rPr>
+                <w:sz w:val="16"/>
+              </w:rPr>
+              <w:t>ตัดสินใจ: แยกอะไหล่</w:t>
+            </w:r>
+          </w:p>
+        </w:tc>
+        <w:tc>
+          <w:tcPr>
+            <w:tcW w:type="dxa" w:w="1701"/>
+            <w:shd w:val="clear" w:color="auto" w:fill="E8F5E9"/>
+          </w:tcPr>
+          <w:p>
+            <w:r>
+              <w:rPr>
+                <w:sz w:val="16"/>
+              </w:rPr>
+              <w:t>R-28</w:t>
+            </w:r>
+          </w:p>
+        </w:tc>
+        <w:tc>
+          <w:tcPr>
+            <w:tcW w:type="dxa" w:w="1984"/>
+            <w:shd w:val="clear" w:color="auto" w:fill="E8F5E9"/>
+          </w:tcPr>
+          <w:p>
+            <w:r>
+              <w:rPr>
+                <w:sz w:val="16"/>
+              </w:rPr>
+              <w:t>S2 เลือก resell_parts (แยกชิ้นส่วนจากซากฟรี)</w:t>
+            </w:r>
+          </w:p>
+        </w:tc>
+        <w:tc>
+          <w:tcPr>
+            <w:tcW w:type="dxa" w:w="1701"/>
+            <w:shd w:val="clear" w:color="auto" w:fill="E8F5E9"/>
+          </w:tcPr>
+          <w:p>
+            <w:r>
+              <w:rPr>
+                <w:sz w:val="16"/>
+              </w:rPr>
+              <w:t>R-27 /scrap/jobs</w:t>
+            </w:r>
+          </w:p>
+        </w:tc>
+        <w:tc>
+          <w:tcPr>
+            <w:tcW w:type="dxa" w:w="1587"/>
+            <w:shd w:val="clear" w:color="auto" w:fill="E8F5E9"/>
+          </w:tcPr>
+          <w:p>
+            <w:r>
+              <w:rPr>
+                <w:sz w:val="16"/>
+              </w:rPr>
+              <w:t>WeeeR</w:t>
+            </w:r>
+          </w:p>
+        </w:tc>
+        <w:tc>
+          <w:tcPr>
+            <w:tcW w:type="dxa" w:w="567"/>
+            <w:shd w:val="clear" w:color="auto" w:fill="E8F5E9"/>
+          </w:tcPr>
+          <w:p>
+            <w:r>
+              <w:rPr>
+                <w:sz w:val="16"/>
+              </w:rPr>
+              <w:t>S2</w:t>
+            </w:r>
+          </w:p>
+        </w:tc>
+        <w:tc>
+          <w:tcPr>
+            <w:tcW w:type="dxa" w:w="1814"/>
+            <w:shd w:val="clear" w:color="auto" w:fill="E8F5E9"/>
+          </w:tcPr>
+          <w:p>
+            <w:r>
+              <w:rPr>
+                <w:sz w:val="16"/>
+              </w:rPr>
+              <w:t>แยกชิ้นส่วนซาก → ขายอะไหล่ต่อใน Marketplace</w:t>
+            </w:r>
+          </w:p>
+        </w:tc>
+        <w:tc>
+          <w:tcPr>
+            <w:tcW w:type="dxa" w:w="3118"/>
+            <w:shd w:val="clear" w:color="auto" w:fill="E8F5E9"/>
+          </w:tcPr>
+          <w:p>
+            <w:r>
+              <w:rPr>
+                <w:sz w:val="16"/>
+              </w:rPr>
+              <w:t>http://localhost:3001/scrap/jobs/SJ001/resell-parts</w:t>
             </w:r>
           </w:p>
         </w:tc>
@@ -4675,7 +5187,7 @@
               <w:rPr>
                 <w:sz w:val="16"/>
               </w:rPr>
-              <w:t>A-11 /scrap/certificates/[id]</w:t>
+              <w:t>A-11b /scrap/certificates/[id]</w:t>
             </w:r>
           </w:p>
         </w:tc>
@@ -4732,6 +5244,134 @@
                 <w:sz w:val="16"/>
               </w:rPr>
               <w:t>http://localhost:3000/scrap/certificates</w:t>
+            </w:r>
+          </w:p>
+        </w:tc>
+      </w:tr>
+      <w:tr>
+        <w:tc>
+          <w:tcPr>
+            <w:tcW w:type="dxa" w:w="680"/>
+            <w:shd w:val="clear" w:color="auto" w:fill="F3E5F5"/>
+          </w:tcPr>
+          <w:p>
+            <w:r>
+              <w:rPr>
+                <w:sz w:val="16"/>
+              </w:rPr>
+              <w:t>A-11b</w:t>
+            </w:r>
+          </w:p>
+        </w:tc>
+        <w:tc>
+          <w:tcPr>
+            <w:tcW w:type="dxa" w:w="1984"/>
+            <w:shd w:val="clear" w:color="auto" w:fill="F3E5F5"/>
+          </w:tcPr>
+          <w:p>
+            <w:r>
+              <w:rPr>
+                <w:sz w:val="16"/>
+              </w:rPr>
+              <w:t>E-Waste Cert Detail (Admin)</w:t>
+            </w:r>
+          </w:p>
+        </w:tc>
+        <w:tc>
+          <w:tcPr>
+            <w:tcW w:type="dxa" w:w="1701"/>
+            <w:shd w:val="clear" w:color="auto" w:fill="F3E5F5"/>
+          </w:tcPr>
+          <w:p>
+            <w:r>
+              <w:rPr>
+                <w:sz w:val="16"/>
+              </w:rPr>
+              <w:t>A-11 /scrap/certificates</w:t>
+            </w:r>
+          </w:p>
+        </w:tc>
+        <w:tc>
+          <w:tcPr>
+            <w:tcW w:type="dxa" w:w="1984"/>
+            <w:shd w:val="clear" w:color="auto" w:fill="F3E5F5"/>
+          </w:tcPr>
+          <w:p>
+            <w:r>
+              <w:rPr>
+                <w:sz w:val="16"/>
+              </w:rPr>
+              <w:t>Admin เลือก cert รายการ → ตรวจสอบ + ออกใบรับรอง</w:t>
+            </w:r>
+          </w:p>
+        </w:tc>
+        <w:tc>
+          <w:tcPr>
+            <w:tcW w:type="dxa" w:w="1701"/>
+            <w:shd w:val="clear" w:color="auto" w:fill="F3E5F5"/>
+          </w:tcPr>
+          <w:p>
+            <w:r>
+              <w:rPr>
+                <w:sz w:val="16"/>
+              </w:rPr>
+              <w:t>— (ออก cert + ปิด request)</w:t>
+            </w:r>
+          </w:p>
+        </w:tc>
+        <w:tc>
+          <w:tcPr>
+            <w:tcW w:type="dxa" w:w="1587"/>
+            <w:shd w:val="clear" w:color="auto" w:fill="F3E5F5"/>
+          </w:tcPr>
+          <w:p>
+            <w:r>
+              <w:rPr>
+                <w:sz w:val="16"/>
+              </w:rPr>
+              <w:t>Admin</w:t>
+            </w:r>
+          </w:p>
+        </w:tc>
+        <w:tc>
+          <w:tcPr>
+            <w:tcW w:type="dxa" w:w="567"/>
+            <w:shd w:val="clear" w:color="auto" w:fill="F3E5F5"/>
+          </w:tcPr>
+          <w:p>
+            <w:r>
+              <w:rPr>
+                <w:sz w:val="16"/>
+              </w:rPr>
+              <w:t>S4</w:t>
+            </w:r>
+          </w:p>
+        </w:tc>
+        <w:tc>
+          <w:tcPr>
+            <w:tcW w:type="dxa" w:w="1814"/>
+            <w:shd w:val="clear" w:color="auto" w:fill="F3E5F5"/>
+          </w:tcPr>
+          <w:p>
+            <w:r>
+              <w:rPr>
+                <w:sz w:val="16"/>
+              </w:rPr>
+              <w:t>Admin พิมพ์ cert EW-2026-xxxx · กด 'ออกใบรับรอง'</w:t>
+            </w:r>
+          </w:p>
+        </w:tc>
+        <w:tc>
+          <w:tcPr>
+            <w:tcW w:type="dxa" w:w="3118"/>
+            <w:shd w:val="clear" w:color="auto" w:fill="F3E5F5"/>
+          </w:tcPr>
+          <w:p>
+            <w:r>
+              <w:rPr>
+                <w:sz w:val="16"/>
+              </w:rPr>
+              <w:t>http://localhost:3000/scrap/certificates/EW-2026-001234</w:t>
             </w:r>
           </w:p>
         </w:tc>
@@ -10555,7 +11195,7 @@
               <w:rPr>
                 <w:sz w:val="16"/>
               </w:rPr>
-              <w:t>R-24</w:t>
+              <w:t>W-13</w:t>
             </w:r>
           </w:p>
         </w:tc>
@@ -10569,7 +11209,7 @@
               <w:rPr>
                 <w:sz w:val="16"/>
               </w:rPr>
-              <w:t>Scrap Announce List</w:t>
+              <w:t>รายการซากสาธารณะ (Website)</w:t>
             </w:r>
           </w:p>
         </w:tc>
@@ -10583,7 +11223,7 @@
               <w:rPr>
                 <w:sz w:val="16"/>
               </w:rPr>
-              <w:t>WeeeR</w:t>
+              <w:t>Website</w:t>
             </w:r>
           </w:p>
         </w:tc>
@@ -10597,7 +11237,7 @@
               <w:rPr>
                 <w:sz w:val="16"/>
               </w:rPr>
-              <w:t>SCRAP-ANNOUNCE-LIST</w:t>
+              <w:t>SCRAP-PUBLIC-LIST</w:t>
             </w:r>
           </w:p>
         </w:tc>
@@ -10611,7 +11251,7 @@
               <w:rPr>
                 <w:sz w:val="16"/>
               </w:rPr>
-              <w:t>R-72 /scrap/browse</w:t>
+              <w:t>W-14 /listings/scrap/[id]</w:t>
             </w:r>
           </w:p>
         </w:tc>
@@ -10625,7 +11265,7 @@
               <w:rPr>
                 <w:sz w:val="16"/>
               </w:rPr>
-              <w:t>WeeeR</w:t>
+              <w:t>Website (สาธารณะ)</w:t>
             </w:r>
           </w:p>
         </w:tc>
@@ -10639,7 +11279,7 @@
               <w:rPr>
                 <w:sz w:val="16"/>
               </w:rPr>
-              <w:t>S1,S2</w:t>
+              <w:t>S1</w:t>
             </w:r>
           </w:p>
         </w:tc>
@@ -10653,7 +11293,7 @@
               <w:rPr>
                 <w:sz w:val="16"/>
               </w:rPr>
-              <w:t>/scrap/announcements → redirect R-72</w:t>
+              <w:t>/listings/scrap · Public listing · no login</w:t>
             </w:r>
           </w:p>
         </w:tc>
@@ -10667,7 +11307,7 @@
               <w:rPr>
                 <w:sz w:val="16"/>
               </w:rPr>
-              <w:t>http://localhost:3001/scrap/announcements</w:t>
+              <w:t>http://localhost:3004/listings/scrap</w:t>
             </w:r>
           </w:p>
         </w:tc>
@@ -10683,7 +11323,7 @@
               <w:rPr>
                 <w:sz w:val="16"/>
               </w:rPr>
-              <w:t>R-25</w:t>
+              <w:t>W-14</w:t>
             </w:r>
           </w:p>
         </w:tc>
@@ -10697,7 +11337,7 @@
               <w:rPr>
                 <w:sz w:val="16"/>
               </w:rPr>
-              <w:t>ยื่น Offer (Scrap)</w:t>
+              <w:t>รายละเอียดซากสาธารณะ (Website)</w:t>
             </w:r>
           </w:p>
         </w:tc>
@@ -10711,7 +11351,7 @@
               <w:rPr>
                 <w:sz w:val="16"/>
               </w:rPr>
-              <w:t>WeeeR</w:t>
+              <w:t>Website</w:t>
             </w:r>
           </w:p>
         </w:tc>
@@ -10725,7 +11365,7 @@
               <w:rPr>
                 <w:sz w:val="16"/>
               </w:rPr>
-              <w:t>SCRAP-BID</w:t>
+              <w:t>SCRAP-PUBLIC-DETAIL</w:t>
             </w:r>
           </w:p>
         </w:tc>
@@ -10739,7 +11379,7 @@
               <w:rPr>
                 <w:sz w:val="16"/>
               </w:rPr>
-              <w:t>U-30 offers (WeeeU)</w:t>
+              <w:t>R-78 /scrap/browse/[id]</w:t>
             </w:r>
           </w:p>
         </w:tc>
@@ -10753,7 +11393,7 @@
               <w:rPr>
                 <w:sz w:val="16"/>
               </w:rPr>
-              <w:t>WeeeR</w:t>
+              <w:t>Website (สาธารณะ) · WeeeR</w:t>
             </w:r>
           </w:p>
         </w:tc>
@@ -10767,7 +11407,7 @@
               <w:rPr>
                 <w:sz w:val="16"/>
               </w:rPr>
-              <w:t>S1,S2</w:t>
+              <w:t>S1</w:t>
             </w:r>
           </w:p>
         </w:tc>
@@ -10781,7 +11421,7 @@
               <w:rPr>
                 <w:sz w:val="16"/>
               </w:rPr>
-              <w:t>/scrap/announcements/[id]/offer · ยื่น offer</w:t>
+              <w:t>/listings/scrap/[id] · Public detail · in-chain S1</w:t>
             </w:r>
           </w:p>
         </w:tc>
@@ -10795,7 +11435,7 @@
               <w:rPr>
                 <w:sz w:val="16"/>
               </w:rPr>
-              <w:t>http://localhost:3001/scrap/announcements</w:t>
+              <w:t>http://localhost:3004/listings/scrap/SCR-001</w:t>
             </w:r>
           </w:p>
         </w:tc>
@@ -10811,7 +11451,7 @@
               <w:rPr>
                 <w:sz w:val="16"/>
               </w:rPr>
-              <w:t>R-26</w:t>
+              <w:t>R-24</w:t>
             </w:r>
           </w:p>
         </w:tc>
@@ -10825,7 +11465,7 @@
               <w:rPr>
                 <w:sz w:val="16"/>
               </w:rPr>
-              <w:t>รายละเอียดประกาศซาก</w:t>
+              <w:t>Scrap Announce List</w:t>
             </w:r>
           </w:p>
         </w:tc>
@@ -10853,7 +11493,7 @@
               <w:rPr>
                 <w:sz w:val="16"/>
               </w:rPr>
-              <w:t>SCRAP-ANNOUNCE-DETAIL</w:t>
+              <w:t>SCRAP-ANNOUNCE-LIST</w:t>
             </w:r>
           </w:p>
         </w:tc>
@@ -10867,7 +11507,7 @@
               <w:rPr>
                 <w:sz w:val="16"/>
               </w:rPr>
-              <w:t>R-78 /scrap/browse/[id]</w:t>
+              <w:t>R-72 /scrap/browse</w:t>
             </w:r>
           </w:p>
         </w:tc>
@@ -10909,7 +11549,7 @@
               <w:rPr>
                 <w:sz w:val="16"/>
               </w:rPr>
-              <w:t>/scrap/announcements/[id]</w:t>
+              <w:t>/scrap/announcements → redirect R-72</w:t>
             </w:r>
           </w:p>
         </w:tc>
@@ -10939,7 +11579,7 @@
               <w:rPr>
                 <w:sz w:val="16"/>
               </w:rPr>
-              <w:t>R-27</w:t>
+              <w:t>R-25</w:t>
             </w:r>
           </w:p>
         </w:tc>
@@ -10953,7 +11593,7 @@
               <w:rPr>
                 <w:sz w:val="16"/>
               </w:rPr>
-              <w:t>งานซากของฉัน (Jobs List)</w:t>
+              <w:t>ยื่น Offer (Scrap)</w:t>
             </w:r>
           </w:p>
         </w:tc>
@@ -10981,7 +11621,7 @@
               <w:rPr>
                 <w:sz w:val="16"/>
               </w:rPr>
-              <w:t>SCRAP-JOBS</w:t>
+              <w:t>SCRAP-BID</w:t>
             </w:r>
           </w:p>
         </w:tc>
@@ -10995,7 +11635,7 @@
               <w:rPr>
                 <w:sz w:val="16"/>
               </w:rPr>
-              <w:t>R-28 /scrap/jobs/[id]</w:t>
+              <w:t>U-30 offers (WeeeU)</w:t>
             </w:r>
           </w:p>
         </w:tc>
@@ -11023,7 +11663,7 @@
               <w:rPr>
                 <w:sz w:val="16"/>
               </w:rPr>
-              <w:t>S1-S12</w:t>
+              <w:t>S1,S2</w:t>
             </w:r>
           </w:p>
         </w:tc>
@@ -11037,7 +11677,7 @@
               <w:rPr>
                 <w:sz w:val="16"/>
               </w:rPr>
-              <w:t>/scrap/jobs · งานซาก S1-S12</w:t>
+              <w:t>/scrap/announcements/[id]/offer · ยื่น offer</w:t>
             </w:r>
           </w:p>
         </w:tc>
@@ -11051,7 +11691,7 @@
               <w:rPr>
                 <w:sz w:val="16"/>
               </w:rPr>
-              <w:t>http://localhost:3001/scrap/jobs</w:t>
+              <w:t>http://localhost:3001/scrap/announcements</w:t>
             </w:r>
           </w:p>
         </w:tc>
@@ -11067,7 +11707,7 @@
               <w:rPr>
                 <w:sz w:val="16"/>
               </w:rPr>
-              <w:t>R-28</w:t>
+              <w:t>R-26</w:t>
             </w:r>
           </w:p>
         </w:tc>
@@ -11081,7 +11721,7 @@
               <w:rPr>
                 <w:sz w:val="16"/>
               </w:rPr>
-              <w:t>งานซาก (Job Detail)</w:t>
+              <w:t>รายละเอียดประกาศซาก</w:t>
             </w:r>
           </w:p>
         </w:tc>
@@ -11109,7 +11749,7 @@
               <w:rPr>
                 <w:sz w:val="16"/>
               </w:rPr>
-              <w:t>SCRAP-JOB-DETAIL</w:t>
+              <w:t>SCRAP-ANNOUNCE-DETAIL</w:t>
             </w:r>
           </w:p>
         </w:tc>
@@ -11123,7 +11763,7 @@
               <w:rPr>
                 <w:sz w:val="16"/>
               </w:rPr>
-              <w:t>R-28b/c/d/e</w:t>
+              <w:t>R-78 /scrap/browse/[id]</w:t>
             </w:r>
           </w:p>
         </w:tc>
@@ -11137,7 +11777,7 @@
               <w:rPr>
                 <w:sz w:val="16"/>
               </w:rPr>
-              <w:t>WeeeR · WeeeU</w:t>
+              <w:t>WeeeR</w:t>
             </w:r>
           </w:p>
         </w:tc>
@@ -11151,7 +11791,7 @@
               <w:rPr>
                 <w:sz w:val="16"/>
               </w:rPr>
-              <w:t>S1-S4,S7,S8,S11,S12</w:t>
+              <w:t>S1,S2</w:t>
             </w:r>
           </w:p>
         </w:tc>
@@ -11165,7 +11805,7 @@
               <w:rPr>
                 <w:sz w:val="16"/>
               </w:rPr>
-              <w:t>/scrap/jobs/[id] · ตัดสินใจ+badge</w:t>
+              <w:t>/scrap/announcements/[id]</w:t>
             </w:r>
           </w:p>
         </w:tc>
@@ -11179,7 +11819,7 @@
               <w:rPr>
                 <w:sz w:val="16"/>
               </w:rPr>
-              <w:t>http://localhost:3001/scrap/jobs/SJ001</w:t>
+              <w:t>http://localhost:3001/scrap/announcements</w:t>
             </w:r>
           </w:p>
         </w:tc>
@@ -11195,7 +11835,7 @@
               <w:rPr>
                 <w:sz w:val="16"/>
               </w:rPr>
-              <w:t>R-28b</w:t>
+              <w:t>R-27</w:t>
             </w:r>
           </w:p>
         </w:tc>
@@ -11209,7 +11849,7 @@
               <w:rPr>
                 <w:sz w:val="16"/>
               </w:rPr>
-              <w:t>ตัดสินใจ: ขายต่อซาก</w:t>
+              <w:t>งานซากของฉัน (Jobs List)</w:t>
             </w:r>
           </w:p>
         </w:tc>
@@ -11237,7 +11877,7 @@
               <w:rPr>
                 <w:sz w:val="16"/>
               </w:rPr>
-              <w:t>SCRAP-S1-DECISION</w:t>
+              <w:t>SCRAP-JOBS</w:t>
             </w:r>
           </w:p>
         </w:tc>
@@ -11251,7 +11891,7 @@
               <w:rPr>
                 <w:sz w:val="16"/>
               </w:rPr>
-              <w:t>R-27 /scrap/jobs</w:t>
+              <w:t>R-28 /scrap/jobs/[id]</w:t>
             </w:r>
           </w:p>
         </w:tc>
@@ -11279,7 +11919,7 @@
               <w:rPr>
                 <w:sz w:val="16"/>
               </w:rPr>
-              <w:t>S1</w:t>
+              <w:t>S1-S12</w:t>
             </w:r>
           </w:p>
         </w:tc>
@@ -11293,7 +11933,7 @@
               <w:rPr>
                 <w:sz w:val="16"/>
               </w:rPr>
-              <w:t>/scrap/jobs/[id]/resell-as-scrap</w:t>
+              <w:t>/scrap/jobs · งานซาก S1-S12</w:t>
             </w:r>
           </w:p>
         </w:tc>
@@ -11307,7 +11947,7 @@
               <w:rPr>
                 <w:sz w:val="16"/>
               </w:rPr>
-              <w:t>http://localhost:3001/scrap/jobs/SJ001/resell-as-scrap</w:t>
+              <w:t>http://localhost:3001/scrap/jobs</w:t>
             </w:r>
           </w:p>
         </w:tc>
@@ -11323,7 +11963,7 @@
               <w:rPr>
                 <w:sz w:val="16"/>
               </w:rPr>
-              <w:t>R-28c</w:t>
+              <w:t>R-28</w:t>
             </w:r>
           </w:p>
         </w:tc>
@@ -11337,7 +11977,7 @@
               <w:rPr>
                 <w:sz w:val="16"/>
               </w:rPr>
-              <w:t>ตัดสินใจ: แยกอะไหล่</w:t>
+              <w:t>งานซาก (Job Detail)</w:t>
             </w:r>
           </w:p>
         </w:tc>
@@ -11365,7 +12005,7 @@
               <w:rPr>
                 <w:sz w:val="16"/>
               </w:rPr>
-              <w:t>SCRAP-S2-DECISION</w:t>
+              <w:t>SCRAP-JOB-DETAIL</w:t>
             </w:r>
           </w:p>
         </w:tc>
@@ -11379,7 +12019,7 @@
               <w:rPr>
                 <w:sz w:val="16"/>
               </w:rPr>
-              <w:t>R-27 /scrap/jobs</w:t>
+              <w:t>R-28b/c/d/e</w:t>
             </w:r>
           </w:p>
         </w:tc>
@@ -11393,7 +12033,7 @@
               <w:rPr>
                 <w:sz w:val="16"/>
               </w:rPr>
-              <w:t>WeeeR</w:t>
+              <w:t>WeeeR · WeeeU</w:t>
             </w:r>
           </w:p>
         </w:tc>
@@ -11407,7 +12047,7 @@
               <w:rPr>
                 <w:sz w:val="16"/>
               </w:rPr>
-              <w:t>S2</w:t>
+              <w:t>S1-S4,S7,S8,S11,S12</w:t>
             </w:r>
           </w:p>
         </w:tc>
@@ -11421,7 +12061,7 @@
               <w:rPr>
                 <w:sz w:val="16"/>
               </w:rPr>
-              <w:t>/scrap/jobs/[id]/resell-parts</w:t>
+              <w:t>/scrap/jobs/[id] · ตัดสินใจ+badge</w:t>
             </w:r>
           </w:p>
         </w:tc>
@@ -11435,7 +12075,7 @@
               <w:rPr>
                 <w:sz w:val="16"/>
               </w:rPr>
-              <w:t>http://localhost:3001/scrap/jobs/SJ001/resell-parts</w:t>
+              <w:t>http://localhost:3001/scrap/jobs/SJ001</w:t>
             </w:r>
           </w:p>
         </w:tc>
@@ -11451,7 +12091,7 @@
               <w:rPr>
                 <w:sz w:val="16"/>
               </w:rPr>
-              <w:t>R-28d</w:t>
+              <w:t>R-28b</w:t>
             </w:r>
           </w:p>
         </w:tc>
@@ -11465,7 +12105,7 @@
               <w:rPr>
                 <w:sz w:val="16"/>
               </w:rPr>
-              <w:t>ตัดสินใจ: ซ่อมขาย</w:t>
+              <w:t>ตัดสินใจ: ขายต่อซาก</w:t>
             </w:r>
           </w:p>
         </w:tc>
@@ -11493,7 +12133,7 @@
               <w:rPr>
                 <w:sz w:val="16"/>
               </w:rPr>
-              <w:t>SCRAP-S3-DECISION</w:t>
+              <w:t>SCRAP-S1-DECISION</w:t>
             </w:r>
           </w:p>
         </w:tc>
@@ -11507,7 +12147,7 @@
               <w:rPr>
                 <w:sz w:val="16"/>
               </w:rPr>
-              <w:t>R-11 /repair/jobs/[id]</w:t>
+              <w:t>R-27 /scrap/jobs</w:t>
             </w:r>
           </w:p>
         </w:tc>
@@ -11521,7 +12161,7 @@
               <w:rPr>
                 <w:sz w:val="16"/>
               </w:rPr>
-              <w:t>WeeeR · WeeeT</w:t>
+              <w:t>WeeeR</w:t>
             </w:r>
           </w:p>
         </w:tc>
@@ -11535,7 +12175,7 @@
               <w:rPr>
                 <w:sz w:val="16"/>
               </w:rPr>
-              <w:t>S3</w:t>
+              <w:t>S1</w:t>
             </w:r>
           </w:p>
         </w:tc>
@@ -11549,7 +12189,7 @@
               <w:rPr>
                 <w:sz w:val="16"/>
               </w:rPr>
-              <w:t>/scrap/jobs/[id]/repair-and-sell</w:t>
+              <w:t>/scrap/jobs/[id]/resell-as-scrap</w:t>
             </w:r>
           </w:p>
         </w:tc>
@@ -11563,7 +12203,7 @@
               <w:rPr>
                 <w:sz w:val="16"/>
               </w:rPr>
-              <w:t>http://localhost:3001/scrap/jobs/SJ001/repair-and-sell</w:t>
+              <w:t>http://localhost:3001/scrap/jobs/SJ001/resell-as-scrap</w:t>
             </w:r>
           </w:p>
         </w:tc>
@@ -11579,7 +12219,7 @@
               <w:rPr>
                 <w:sz w:val="16"/>
               </w:rPr>
-              <w:t>R-28e</w:t>
+              <w:t>R-28c</w:t>
             </w:r>
           </w:p>
         </w:tc>
@@ -11593,7 +12233,7 @@
               <w:rPr>
                 <w:sz w:val="16"/>
               </w:rPr>
-              <w:t>ตัดสินใจ: รีไซเคิล/E-Waste</w:t>
+              <w:t>ตัดสินใจ: แยกอะไหล่</w:t>
             </w:r>
           </w:p>
         </w:tc>
@@ -11621,7 +12261,7 @@
               <w:rPr>
                 <w:sz w:val="16"/>
               </w:rPr>
-              <w:t>SCRAP-S4-DECISION</w:t>
+              <w:t>SCRAP-S2-DECISION</w:t>
             </w:r>
           </w:p>
         </w:tc>
@@ -11635,7 +12275,7 @@
               <w:rPr>
                 <w:sz w:val="16"/>
               </w:rPr>
-              <w:t>A-11 /scrap/certificates</w:t>
+              <w:t>R-27 /scrap/jobs</w:t>
             </w:r>
           </w:p>
         </w:tc>
@@ -11649,7 +12289,7 @@
               <w:rPr>
                 <w:sz w:val="16"/>
               </w:rPr>
-              <w:t>WeeeR · Admin</w:t>
+              <w:t>WeeeR</w:t>
             </w:r>
           </w:p>
         </w:tc>
@@ -11663,7 +12303,7 @@
               <w:rPr>
                 <w:sz w:val="16"/>
               </w:rPr>
-              <w:t>S4</w:t>
+              <w:t>S2</w:t>
             </w:r>
           </w:p>
         </w:tc>
@@ -11677,7 +12317,7 @@
               <w:rPr>
                 <w:sz w:val="16"/>
               </w:rPr>
-              <w:t>/scrap/jobs/[id]/dispose</w:t>
+              <w:t>/scrap/jobs/[id]/resell-parts</w:t>
             </w:r>
           </w:p>
         </w:tc>
@@ -11691,7 +12331,7 @@
               <w:rPr>
                 <w:sz w:val="16"/>
               </w:rPr>
-              <w:t>http://localhost:3001/scrap/jobs/SJ001/dispose</w:t>
+              <w:t>http://localhost:3001/scrap/jobs/SJ001/resell-parts</w:t>
             </w:r>
           </w:p>
         </w:tc>
@@ -11707,7 +12347,7 @@
               <w:rPr>
                 <w:sz w:val="16"/>
               </w:rPr>
-              <w:t>R-70</w:t>
+              <w:t>R-28d</w:t>
             </w:r>
           </w:p>
         </w:tc>
@@ -11721,7 +12361,7 @@
               <w:rPr>
                 <w:sz w:val="16"/>
               </w:rPr>
-              <w:t>Scrap Hub Feed (Public)</w:t>
+              <w:t>ตัดสินใจ: ซ่อมขาย</w:t>
             </w:r>
           </w:p>
         </w:tc>
@@ -11749,7 +12389,7 @@
               <w:rPr>
                 <w:sz w:val="16"/>
               </w:rPr>
-              <w:t>SCRAP-HUB</w:t>
+              <w:t>SCRAP-S3-DECISION</w:t>
             </w:r>
           </w:p>
         </w:tc>
@@ -11763,7 +12403,7 @@
               <w:rPr>
                 <w:sz w:val="16"/>
               </w:rPr>
-              <w:t>R-78 /scrap/browse/[id]</w:t>
+              <w:t>R-11 /repair/jobs/[id]</w:t>
             </w:r>
           </w:p>
         </w:tc>
@@ -11777,7 +12417,7 @@
               <w:rPr>
                 <w:sz w:val="16"/>
               </w:rPr>
-              <w:t>WeeeR</w:t>
+              <w:t>WeeeR · WeeeT</w:t>
             </w:r>
           </w:p>
         </w:tc>
@@ -11791,7 +12431,7 @@
               <w:rPr>
                 <w:sz w:val="16"/>
               </w:rPr>
-              <w:t>S1,S2,S12</w:t>
+              <w:t>S3</w:t>
             </w:r>
           </w:p>
         </w:tc>
@@ -11805,7 +12445,7 @@
               <w:rPr>
                 <w:sz w:val="16"/>
               </w:rPr>
-              <w:t>/scrap · Public feed</w:t>
+              <w:t>/scrap/jobs/[id]/repair-and-sell</w:t>
             </w:r>
           </w:p>
         </w:tc>
@@ -11819,7 +12459,7 @@
               <w:rPr>
                 <w:sz w:val="16"/>
               </w:rPr>
-              <w:t>http://localhost:3001/scrap</w:t>
+              <w:t>http://localhost:3001/scrap/jobs/SJ001/repair-and-sell</w:t>
             </w:r>
           </w:p>
         </w:tc>
@@ -11835,7 +12475,7 @@
               <w:rPr>
                 <w:sz w:val="16"/>
               </w:rPr>
-              <w:t>R-71</w:t>
+              <w:t>R-28e</w:t>
             </w:r>
           </w:p>
         </w:tc>
@@ -11849,7 +12489,7 @@
               <w:rPr>
                 <w:sz w:val="16"/>
               </w:rPr>
-              <w:t>Scrap Item Detail (Public)</w:t>
+              <w:t>ตัดสินใจ: รีไซเคิล/E-Waste</w:t>
             </w:r>
           </w:p>
         </w:tc>
@@ -11877,7 +12517,7 @@
               <w:rPr>
                 <w:sz w:val="16"/>
               </w:rPr>
-              <w:t>SCRAP-ITEM-DETAIL</w:t>
+              <w:t>SCRAP-S4-DECISION</w:t>
             </w:r>
           </w:p>
         </w:tc>
@@ -11891,7 +12531,7 @@
               <w:rPr>
                 <w:sz w:val="16"/>
               </w:rPr>
-              <w:t>R-28 (ซื้อ)</w:t>
+              <w:t>A-11 /scrap/certificates</w:t>
             </w:r>
           </w:p>
         </w:tc>
@@ -11905,7 +12545,7 @@
               <w:rPr>
                 <w:sz w:val="16"/>
               </w:rPr>
-              <w:t>WeeeR</w:t>
+              <w:t>WeeeR · Admin</w:t>
             </w:r>
           </w:p>
         </w:tc>
@@ -11919,7 +12559,7 @@
               <w:rPr>
                 <w:sz w:val="16"/>
               </w:rPr>
-              <w:t>S1,S2</w:t>
+              <w:t>S4</w:t>
             </w:r>
           </w:p>
         </w:tc>
@@ -11933,7 +12573,7 @@
               <w:rPr>
                 <w:sz w:val="16"/>
               </w:rPr>
-              <w:t>/scrap/[id] · Public detail</w:t>
+              <w:t>/scrap/jobs/[id]/dispose</w:t>
             </w:r>
           </w:p>
         </w:tc>
@@ -11947,7 +12587,7 @@
               <w:rPr>
                 <w:sz w:val="16"/>
               </w:rPr>
-              <w:t>http://localhost:3001/scrap/SCR-001</w:t>
+              <w:t>http://localhost:3001/scrap/jobs/SJ001/dispose</w:t>
             </w:r>
           </w:p>
         </w:tc>
@@ -11963,7 +12603,7 @@
               <w:rPr>
                 <w:sz w:val="16"/>
               </w:rPr>
-              <w:t>R-72</w:t>
+              <w:t>R-70</w:t>
             </w:r>
           </w:p>
         </w:tc>
@@ -11977,7 +12617,7 @@
               <w:rPr>
                 <w:sz w:val="16"/>
               </w:rPr>
-              <w:t>เลือกซื้อซาก (Browse+Filter)</w:t>
+              <w:t>Scrap Hub Feed (Public)</w:t>
             </w:r>
           </w:p>
         </w:tc>
@@ -12005,7 +12645,7 @@
               <w:rPr>
                 <w:sz w:val="16"/>
               </w:rPr>
-              <w:t>SCRAP-BROWSE</w:t>
+              <w:t>SCRAP-HUB</w:t>
             </w:r>
           </w:p>
         </w:tc>
@@ -12047,7 +12687,7 @@
               <w:rPr>
                 <w:sz w:val="16"/>
               </w:rPr>
-              <w:t>S1,S2</w:t>
+              <w:t>S1,S2,S12</w:t>
             </w:r>
           </w:p>
         </w:tc>
@@ -12061,7 +12701,7 @@
               <w:rPr>
                 <w:sz w:val="16"/>
               </w:rPr>
-              <w:t>/scrap/browse · grade/ราคา filter</w:t>
+              <w:t>/scrap · Public feed</w:t>
             </w:r>
           </w:p>
         </w:tc>
@@ -12075,7 +12715,7 @@
               <w:rPr>
                 <w:sz w:val="16"/>
               </w:rPr>
-              <w:t>http://localhost:3001/scrap/browse</w:t>
+              <w:t>http://localhost:3001/scrap</w:t>
             </w:r>
           </w:p>
         </w:tc>
@@ -12091,7 +12731,7 @@
               <w:rPr>
                 <w:sz w:val="16"/>
               </w:rPr>
-              <w:t>R-78</w:t>
+              <w:t>R-71</w:t>
             </w:r>
           </w:p>
         </w:tc>
@@ -12105,7 +12745,7 @@
               <w:rPr>
                 <w:sz w:val="16"/>
               </w:rPr>
-              <w:t>รายละเอียด + ปุ่มซื้อ</w:t>
+              <w:t>Scrap Item Detail (Public)</w:t>
             </w:r>
           </w:p>
         </w:tc>
@@ -12133,7 +12773,7 @@
               <w:rPr>
                 <w:sz w:val="16"/>
               </w:rPr>
-              <w:t>SCRAP-BROWSE-DETAIL</w:t>
+              <w:t>SCRAP-ITEM-DETAIL</w:t>
             </w:r>
           </w:p>
         </w:tc>
@@ -12147,7 +12787,7 @@
               <w:rPr>
                 <w:sz w:val="16"/>
               </w:rPr>
-              <w:t>R-28 /scrap/jobs/[id]</w:t>
+              <w:t>R-28 (ซื้อ)</w:t>
             </w:r>
           </w:p>
         </w:tc>
@@ -12161,7 +12801,7 @@
               <w:rPr>
                 <w:sz w:val="16"/>
               </w:rPr>
-              <w:t>WeeeR · WeeeU</w:t>
+              <w:t>WeeeR</w:t>
             </w:r>
           </w:p>
         </w:tc>
@@ -12189,7 +12829,7 @@
               <w:rPr>
                 <w:sz w:val="16"/>
               </w:rPr>
-              <w:t>/scrap/browse/[id] · ซื้อซากนี้</w:t>
+              <w:t>/scrap/[id] · Public detail</w:t>
             </w:r>
           </w:p>
         </w:tc>
@@ -12203,7 +12843,7 @@
               <w:rPr>
                 <w:sz w:val="16"/>
               </w:rPr>
-              <w:t>http://localhost:3001/scrap/browse/SCR-001</w:t>
+              <w:t>http://localhost:3001/scrap/SCR-001</w:t>
             </w:r>
           </w:p>
         </w:tc>
@@ -12219,7 +12859,7 @@
               <w:rPr>
                 <w:sz w:val="16"/>
               </w:rPr>
-              <w:t>T-04</w:t>
+              <w:t>R-72</w:t>
             </w:r>
           </w:p>
         </w:tc>
@@ -12233,7 +12873,7 @@
               <w:rPr>
                 <w:sz w:val="16"/>
               </w:rPr>
-              <w:t>รับซาก (Pickup / No Show)</w:t>
+              <w:t>เลือกซื้อซาก (Browse+Filter)</w:t>
             </w:r>
           </w:p>
         </w:tc>
@@ -12247,7 +12887,7 @@
               <w:rPr>
                 <w:sz w:val="16"/>
               </w:rPr>
-              <w:t>WeeeT</w:t>
+              <w:t>WeeeR</w:t>
             </w:r>
           </w:p>
         </w:tc>
@@ -12261,7 +12901,7 @@
               <w:rPr>
                 <w:sz w:val="16"/>
               </w:rPr>
-              <w:t>SCRAP-S6-PICKUP</w:t>
+              <w:t>SCRAP-BROWSE</w:t>
             </w:r>
           </w:p>
         </w:tc>
@@ -12275,7 +12915,7 @@
               <w:rPr>
                 <w:sz w:val="16"/>
               </w:rPr>
-              <w:t>T-22 /scrap</w:t>
+              <w:t>R-78 /scrap/browse/[id]</w:t>
             </w:r>
           </w:p>
         </w:tc>
@@ -12289,7 +12929,7 @@
               <w:rPr>
                 <w:sz w:val="16"/>
               </w:rPr>
-              <w:t>WeeeT · WeeeU</w:t>
+              <w:t>WeeeR</w:t>
             </w:r>
           </w:p>
         </w:tc>
@@ -12303,7 +12943,7 @@
               <w:rPr>
                 <w:sz w:val="16"/>
               </w:rPr>
-              <w:t>S6,S9</w:t>
+              <w:t>S1,S2</w:t>
             </w:r>
           </w:p>
         </w:tc>
@@ -12317,7 +12957,7 @@
               <w:rPr>
                 <w:sz w:val="16"/>
               </w:rPr>
-              <w:t>/jobs/[id]/pickup · S6·S9</w:t>
+              <w:t>/scrap/browse · grade/ราคา filter</w:t>
             </w:r>
           </w:p>
         </w:tc>
@@ -12331,7 +12971,7 @@
               <w:rPr>
                 <w:sz w:val="16"/>
               </w:rPr>
-              <w:t>http://localhost:3003/jobs/J001/pickup</w:t>
+              <w:t>http://localhost:3001/scrap/browse</w:t>
             </w:r>
           </w:p>
         </w:tc>
@@ -12347,7 +12987,7 @@
               <w:rPr>
                 <w:sz w:val="16"/>
               </w:rPr>
-              <w:t>T-06</w:t>
+              <w:t>R-78</w:t>
             </w:r>
           </w:p>
         </w:tc>
@@ -12361,7 +13001,7 @@
               <w:rPr>
                 <w:sz w:val="16"/>
               </w:rPr>
-              <w:t>Repair C4 Scrap Offer (WeeeT)</w:t>
+              <w:t>รายละเอียด + ปุ่มซื้อ</w:t>
             </w:r>
           </w:p>
         </w:tc>
@@ -12375,7 +13015,7 @@
               <w:rPr>
                 <w:sz w:val="16"/>
               </w:rPr>
-              <w:t>WeeeT</w:t>
+              <w:t>WeeeR</w:t>
             </w:r>
           </w:p>
         </w:tc>
@@ -12389,7 +13029,7 @@
               <w:rPr>
                 <w:sz w:val="16"/>
               </w:rPr>
-              <w:t>REPAIR-C4-SCRAP</w:t>
+              <w:t>SCRAP-BROWSE-DETAIL</w:t>
             </w:r>
           </w:p>
         </w:tc>
@@ -12403,7 +13043,7 @@
               <w:rPr>
                 <w:sz w:val="16"/>
               </w:rPr>
-              <w:t>T-11 /jobs/[id]</w:t>
+              <w:t>R-28 /scrap/jobs/[id]</w:t>
             </w:r>
           </w:p>
         </w:tc>
@@ -12417,7 +13057,7 @@
               <w:rPr>
                 <w:sz w:val="16"/>
               </w:rPr>
-              <w:t>WeeeT · WeeeU</w:t>
+              <w:t>WeeeR · WeeeU</w:t>
             </w:r>
           </w:p>
         </w:tc>
@@ -12431,7 +13071,7 @@
               <w:rPr>
                 <w:sz w:val="16"/>
               </w:rPr>
-              <w:t>S12</w:t>
+              <w:t>S1,S2</w:t>
             </w:r>
           </w:p>
         </w:tc>
@@ -12445,7 +13085,7 @@
               <w:rPr>
                 <w:sz w:val="16"/>
               </w:rPr>
-              <w:t>/jobs/[id]/scrap-offer · S12 C4 assessed price</w:t>
+              <w:t>/scrap/browse/[id] · ซื้อซากนี้</w:t>
             </w:r>
           </w:p>
         </w:tc>
@@ -12459,7 +13099,7 @@
               <w:rPr>
                 <w:sz w:val="16"/>
               </w:rPr>
-              <w:t>http://localhost:3003/jobs/c001/scrap-offer</w:t>
+              <w:t>http://localhost:3001/scrap/browse/SCR-001</w:t>
             </w:r>
           </w:p>
         </w:tc>
@@ -12475,7 +13115,7 @@
               <w:rPr>
                 <w:sz w:val="16"/>
               </w:rPr>
-              <w:t>T-10</w:t>
+              <w:t>T-04</w:t>
             </w:r>
           </w:p>
         </w:tc>
@@ -12489,7 +13129,7 @@
               <w:rPr>
                 <w:sz w:val="16"/>
               </w:rPr>
-              <w:t>รายงานซากไม่ตรง (Mismatch)</w:t>
+              <w:t>รับซาก (Pickup / No Show)</w:t>
             </w:r>
           </w:p>
         </w:tc>
@@ -12517,7 +13157,7 @@
               <w:rPr>
                 <w:sz w:val="16"/>
               </w:rPr>
-              <w:t>SCRAP-S8-MISMATCH</w:t>
+              <w:t>SCRAP-S6-PICKUP</w:t>
             </w:r>
           </w:p>
         </w:tc>
@@ -12545,7 +13185,7 @@
               <w:rPr>
                 <w:sz w:val="16"/>
               </w:rPr>
-              <w:t>WeeeT · WeeeU · WeeeR</w:t>
+              <w:t>WeeeT · WeeeU</w:t>
             </w:r>
           </w:p>
         </w:tc>
@@ -12559,7 +13199,7 @@
               <w:rPr>
                 <w:sz w:val="16"/>
               </w:rPr>
-              <w:t>S8</w:t>
+              <w:t>S6,S9</w:t>
             </w:r>
           </w:p>
         </w:tc>
@@ -12573,7 +13213,7 @@
               <w:rPr>
                 <w:sz w:val="16"/>
               </w:rPr>
-              <w:t>/jobs/[id]/mismatch · S8</w:t>
+              <w:t>/jobs/[id]/pickup · S6·S9</w:t>
             </w:r>
           </w:p>
         </w:tc>
@@ -12587,7 +13227,7 @@
               <w:rPr>
                 <w:sz w:val="16"/>
               </w:rPr>
-              <w:t>http://localhost:3003/jobs/J001/mismatch</w:t>
+              <w:t>http://localhost:3003/jobs/J001/pickup</w:t>
             </w:r>
           </w:p>
         </w:tc>
@@ -12603,7 +13243,7 @@
               <w:rPr>
                 <w:sz w:val="16"/>
               </w:rPr>
-              <w:t>T-22</w:t>
+              <w:t>T-06</w:t>
             </w:r>
           </w:p>
         </w:tc>
@@ -12617,7 +13257,7 @@
               <w:rPr>
                 <w:sz w:val="16"/>
               </w:rPr>
-              <w:t>Scrap Jobs List (WeeeT)</w:t>
+              <w:t>Repair C4 Scrap Offer (WeeeT)</w:t>
             </w:r>
           </w:p>
         </w:tc>
@@ -12645,7 +13285,7 @@
               <w:rPr>
                 <w:sz w:val="16"/>
               </w:rPr>
-              <w:t>SCRAP-HOME (T)</w:t>
+              <w:t>REPAIR-C4-SCRAP</w:t>
             </w:r>
           </w:p>
         </w:tc>
@@ -12659,7 +13299,7 @@
               <w:rPr>
                 <w:sz w:val="16"/>
               </w:rPr>
-              <w:t>T-23 /scrap/[id]</w:t>
+              <w:t>T-11 /jobs/[id]</w:t>
             </w:r>
           </w:p>
         </w:tc>
@@ -12673,7 +13313,7 @@
               <w:rPr>
                 <w:sz w:val="16"/>
               </w:rPr>
-              <w:t>WeeeT</w:t>
+              <w:t>WeeeT · WeeeU</w:t>
             </w:r>
           </w:p>
         </w:tc>
@@ -12687,7 +13327,7 @@
               <w:rPr>
                 <w:sz w:val="16"/>
               </w:rPr>
-              <w:t>S6,S9,S12</w:t>
+              <w:t>S12</w:t>
             </w:r>
           </w:p>
         </w:tc>
@@ -12701,7 +13341,7 @@
               <w:rPr>
                 <w:sz w:val="16"/>
               </w:rPr>
-              <w:t>/scrap · WeeeT scrap list</w:t>
+              <w:t>/jobs/[id]/scrap-offer · S12 C4 assessed price</w:t>
             </w:r>
           </w:p>
         </w:tc>
@@ -12715,7 +13355,7 @@
               <w:rPr>
                 <w:sz w:val="16"/>
               </w:rPr>
-              <w:t>http://localhost:3003/scrap</w:t>
+              <w:t>http://localhost:3003/jobs/c001/scrap-offer</w:t>
             </w:r>
           </w:p>
         </w:tc>
@@ -12731,7 +13371,7 @@
               <w:rPr>
                 <w:sz w:val="16"/>
               </w:rPr>
-              <w:t>T-23</w:t>
+              <w:t>T-10</w:t>
             </w:r>
           </w:p>
         </w:tc>
@@ -12745,7 +13385,7 @@
               <w:rPr>
                 <w:sz w:val="16"/>
               </w:rPr>
-              <w:t>Scrap Job Detail (WeeeT)</w:t>
+              <w:t>รายงานซากไม่ตรง (Mismatch)</w:t>
             </w:r>
           </w:p>
         </w:tc>
@@ -12773,7 +13413,7 @@
               <w:rPr>
                 <w:sz w:val="16"/>
               </w:rPr>
-              <w:t>SCRAP-DETAIL (T)</w:t>
+              <w:t>SCRAP-S8-MISMATCH</w:t>
             </w:r>
           </w:p>
         </w:tc>
@@ -12787,7 +13427,7 @@
               <w:rPr>
                 <w:sz w:val="16"/>
               </w:rPr>
-              <w:t>T-04 /pickup</w:t>
+              <w:t>T-22 /scrap</w:t>
             </w:r>
           </w:p>
         </w:tc>
@@ -12801,7 +13441,7 @@
               <w:rPr>
                 <w:sz w:val="16"/>
               </w:rPr>
-              <w:t>WeeeT</w:t>
+              <w:t>WeeeT · WeeeU · WeeeR</w:t>
             </w:r>
           </w:p>
         </w:tc>
@@ -12815,7 +13455,7 @@
               <w:rPr>
                 <w:sz w:val="16"/>
               </w:rPr>
-              <w:t>S6,S9,S12</w:t>
+              <w:t>S8</w:t>
             </w:r>
           </w:p>
         </w:tc>
@@ -12829,7 +13469,7 @@
               <w:rPr>
                 <w:sz w:val="16"/>
               </w:rPr>
-              <w:t>/scrap/[id] · WeeeT job detail</w:t>
+              <w:t>/jobs/[id]/mismatch · S8</w:t>
             </w:r>
           </w:p>
         </w:tc>
@@ -12843,7 +13483,7 @@
               <w:rPr>
                 <w:sz w:val="16"/>
               </w:rPr>
-              <w:t>http://localhost:3003/scrap/J001</w:t>
+              <w:t>http://localhost:3003/jobs/J001/mismatch</w:t>
             </w:r>
           </w:p>
         </w:tc>
@@ -12859,7 +13499,7 @@
               <w:rPr>
                 <w:sz w:val="16"/>
               </w:rPr>
-              <w:t>A-08</w:t>
+              <w:t>T-22</w:t>
             </w:r>
           </w:p>
         </w:tc>
@@ -12873,7 +13513,7 @@
               <w:rPr>
                 <w:sz w:val="16"/>
               </w:rPr>
-              <w:t>Scrap Jobs Overview (Admin)</w:t>
+              <w:t>Scrap Jobs List (WeeeT)</w:t>
             </w:r>
           </w:p>
         </w:tc>
@@ -12887,7 +13527,7 @@
               <w:rPr>
                 <w:sz w:val="16"/>
               </w:rPr>
-              <w:t>Admin</w:t>
+              <w:t>WeeeT</w:t>
             </w:r>
           </w:p>
         </w:tc>
@@ -12901,7 +13541,7 @@
               <w:rPr>
                 <w:sz w:val="16"/>
               </w:rPr>
-              <w:t>SCRAP-JOBS-ADMIN</w:t>
+              <w:t>SCRAP-HOME (T)</w:t>
             </w:r>
           </w:p>
         </w:tc>
@@ -12915,7 +13555,7 @@
               <w:rPr>
                 <w:sz w:val="16"/>
               </w:rPr>
-              <w:t>A-09 /scrap/disputes</w:t>
+              <w:t>T-23 /scrap/[id]</w:t>
             </w:r>
           </w:p>
         </w:tc>
@@ -12929,7 +13569,7 @@
               <w:rPr>
                 <w:sz w:val="16"/>
               </w:rPr>
-              <w:t>Admin</w:t>
+              <w:t>WeeeT</w:t>
             </w:r>
           </w:p>
         </w:tc>
@@ -12943,7 +13583,7 @@
               <w:rPr>
                 <w:sz w:val="16"/>
               </w:rPr>
-              <w:t>S1-S12</w:t>
+              <w:t>S6,S9,S12</w:t>
             </w:r>
           </w:p>
         </w:tc>
@@ -12957,7 +13597,7 @@
               <w:rPr>
                 <w:sz w:val="16"/>
               </w:rPr>
-              <w:t>/scrap/jobs · overview ทุก jobs</w:t>
+              <w:t>/scrap · WeeeT scrap list</w:t>
             </w:r>
           </w:p>
         </w:tc>
@@ -12971,7 +13611,7 @@
               <w:rPr>
                 <w:sz w:val="16"/>
               </w:rPr>
-              <w:t>http://localhost:3000/scrap/jobs</w:t>
+              <w:t>http://localhost:3003/scrap</w:t>
             </w:r>
           </w:p>
         </w:tc>
@@ -12987,7 +13627,7 @@
               <w:rPr>
                 <w:sz w:val="16"/>
               </w:rPr>
-              <w:t>A-09</w:t>
+              <w:t>T-23</w:t>
             </w:r>
           </w:p>
         </w:tc>
@@ -13001,7 +13641,7 @@
               <w:rPr>
                 <w:sz w:val="16"/>
               </w:rPr>
-              <w:t>Dispute List (Admin)</w:t>
+              <w:t>Scrap Job Detail (WeeeT)</w:t>
             </w:r>
           </w:p>
         </w:tc>
@@ -13015,7 +13655,7 @@
               <w:rPr>
                 <w:sz w:val="16"/>
               </w:rPr>
-              <w:t>Admin</w:t>
+              <w:t>WeeeT</w:t>
             </w:r>
           </w:p>
         </w:tc>
@@ -13029,7 +13669,7 @@
               <w:rPr>
                 <w:sz w:val="16"/>
               </w:rPr>
-              <w:t>SCRAP-DISPUTES</w:t>
+              <w:t>SCRAP-DETAIL (T)</w:t>
             </w:r>
           </w:p>
         </w:tc>
@@ -13043,7 +13683,7 @@
               <w:rPr>
                 <w:sz w:val="16"/>
               </w:rPr>
-              <w:t>A-10 /scrap/disputes/[id]</w:t>
+              <w:t>T-04 /pickup</w:t>
             </w:r>
           </w:p>
         </w:tc>
@@ -13057,7 +13697,7 @@
               <w:rPr>
                 <w:sz w:val="16"/>
               </w:rPr>
-              <w:t>Admin</w:t>
+              <w:t>WeeeT</w:t>
             </w:r>
           </w:p>
         </w:tc>
@@ -13071,7 +13711,7 @@
               <w:rPr>
                 <w:sz w:val="16"/>
               </w:rPr>
-              <w:t>S11</w:t>
+              <w:t>S6,S9,S12</w:t>
             </w:r>
           </w:p>
         </w:tc>
@@ -13085,7 +13725,7 @@
               <w:rPr>
                 <w:sz w:val="16"/>
               </w:rPr>
-              <w:t>/scrap/disputes · S11 dispute list</w:t>
+              <w:t>/scrap/[id] · WeeeT job detail</w:t>
             </w:r>
           </w:p>
         </w:tc>
@@ -13099,7 +13739,7 @@
               <w:rPr>
                 <w:sz w:val="16"/>
               </w:rPr>
-              <w:t>http://localhost:3000/scrap/disputes</w:t>
+              <w:t>http://localhost:3003/scrap/J001</w:t>
             </w:r>
           </w:p>
         </w:tc>
@@ -13115,7 +13755,7 @@
               <w:rPr>
                 <w:sz w:val="16"/>
               </w:rPr>
-              <w:t>A-10</w:t>
+              <w:t>A-08</w:t>
             </w:r>
           </w:p>
         </w:tc>
@@ -13129,7 +13769,7 @@
               <w:rPr>
                 <w:sz w:val="16"/>
               </w:rPr>
-              <w:t>Dispute Detail (Admin)</w:t>
+              <w:t>Scrap Jobs Overview (Admin)</w:t>
             </w:r>
           </w:p>
         </w:tc>
@@ -13157,7 +13797,7 @@
               <w:rPr>
                 <w:sz w:val="16"/>
               </w:rPr>
-              <w:t>SCRAP-DISPUTE-DETAIL</w:t>
+              <w:t>SCRAP-JOBS-ADMIN</w:t>
             </w:r>
           </w:p>
         </w:tc>
@@ -13171,7 +13811,7 @@
               <w:rPr>
                 <w:sz w:val="16"/>
               </w:rPr>
-              <w:t>A-09 /scrap/disputes</w:t>
+              <w:t>A-08b /scrap/jobs/[id]</w:t>
             </w:r>
           </w:p>
         </w:tc>
@@ -13185,7 +13825,7 @@
               <w:rPr>
                 <w:sz w:val="16"/>
               </w:rPr>
-              <w:t>Admin · WeeeR · WeeeU</w:t>
+              <w:t>Admin</w:t>
             </w:r>
           </w:p>
         </w:tc>
@@ -13199,7 +13839,7 @@
               <w:rPr>
                 <w:sz w:val="16"/>
               </w:rPr>
-              <w:t>S11</w:t>
+              <w:t>S1-S12</w:t>
             </w:r>
           </w:p>
         </w:tc>
@@ -13213,7 +13853,7 @@
               <w:rPr>
                 <w:sz w:val="16"/>
               </w:rPr>
-              <w:t>/scrap/disputes/[id] · S11 ตัดสิน</w:t>
+              <w:t>/scrap/jobs · overview ทุก jobs</w:t>
             </w:r>
           </w:p>
         </w:tc>
@@ -13227,7 +13867,7 @@
               <w:rPr>
                 <w:sz w:val="16"/>
               </w:rPr>
-              <w:t>http://localhost:3000/scrap/disputes/D001</w:t>
+              <w:t>http://localhost:3000/scrap/jobs</w:t>
             </w:r>
           </w:p>
         </w:tc>
@@ -13243,7 +13883,7 @@
               <w:rPr>
                 <w:sz w:val="16"/>
               </w:rPr>
-              <w:t>A-11</w:t>
+              <w:t>A-08b</w:t>
             </w:r>
           </w:p>
         </w:tc>
@@ -13257,7 +13897,7 @@
               <w:rPr>
                 <w:sz w:val="16"/>
               </w:rPr>
-              <w:t>E-Waste Certificates (Admin)</w:t>
+              <w:t>Scrap Job Detail (Admin)</w:t>
             </w:r>
           </w:p>
         </w:tc>
@@ -13271,7 +13911,7 @@
               <w:rPr>
                 <w:sz w:val="16"/>
               </w:rPr>
-              <w:t>Admin</w:t>
+              <w:t>A-08 /scrap/jobs</w:t>
             </w:r>
           </w:p>
         </w:tc>
@@ -13285,7 +13925,7 @@
               <w:rPr>
                 <w:sz w:val="16"/>
               </w:rPr>
-              <w:t>SCRAP-CERTS</w:t>
+              <w:t>SCRAP-JOB-DETAIL-ADMIN</w:t>
             </w:r>
           </w:p>
         </w:tc>
@@ -13299,7 +13939,7 @@
               <w:rPr>
                 <w:sz w:val="16"/>
               </w:rPr>
-              <w:t>A-11 /scrap/certificates/[id]</w:t>
+              <w:t>A-08 /scrap/jobs</w:t>
             </w:r>
           </w:p>
         </w:tc>
@@ -13313,7 +13953,7 @@
               <w:rPr>
                 <w:sz w:val="16"/>
               </w:rPr>
-              <w:t>Admin · WeeeU</w:t>
+              <w:t>Admin</w:t>
             </w:r>
           </w:p>
         </w:tc>
@@ -13327,7 +13967,7 @@
               <w:rPr>
                 <w:sz w:val="16"/>
               </w:rPr>
-              <w:t>S4</w:t>
+              <w:t>S1-S12</w:t>
             </w:r>
           </w:p>
         </w:tc>
@@ -13341,7 +13981,7 @@
               <w:rPr>
                 <w:sz w:val="16"/>
               </w:rPr>
-              <w:t>/scrap/certificates · S4 cert mgmt</w:t>
+              <w:t>/scrap/jobs/[id] · Admin drill-down</w:t>
             </w:r>
           </w:p>
         </w:tc>
@@ -13355,7 +13995,775 @@
               <w:rPr>
                 <w:sz w:val="16"/>
               </w:rPr>
+              <w:t>http://localhost:3000/scrap/jobs/SJ001</w:t>
+            </w:r>
+          </w:p>
+        </w:tc>
+      </w:tr>
+      <w:tr>
+        <w:tc>
+          <w:tcPr>
+            <w:tcW w:type="dxa" w:w="680"/>
+            <w:shd w:val="clear" w:color="auto" w:fill="F5F5F5"/>
+          </w:tcPr>
+          <w:p>
+            <w:r>
+              <w:rPr>
+                <w:sz w:val="16"/>
+              </w:rPr>
+              <w:t>A-09</w:t>
+            </w:r>
+          </w:p>
+        </w:tc>
+        <w:tc>
+          <w:tcPr>
+            <w:tcW w:type="dxa" w:w="1984"/>
+            <w:shd w:val="clear" w:color="auto" w:fill="F5F5F5"/>
+          </w:tcPr>
+          <w:p>
+            <w:r>
+              <w:rPr>
+                <w:sz w:val="16"/>
+              </w:rPr>
+              <w:t>Dispute List (Admin)</w:t>
+            </w:r>
+          </w:p>
+        </w:tc>
+        <w:tc>
+          <w:tcPr>
+            <w:tcW w:type="dxa" w:w="1701"/>
+            <w:shd w:val="clear" w:color="auto" w:fill="F5F5F5"/>
+          </w:tcPr>
+          <w:p>
+            <w:r>
+              <w:rPr>
+                <w:sz w:val="16"/>
+              </w:rPr>
+              <w:t>Admin</w:t>
+            </w:r>
+          </w:p>
+        </w:tc>
+        <w:tc>
+          <w:tcPr>
+            <w:tcW w:type="dxa" w:w="1984"/>
+            <w:shd w:val="clear" w:color="auto" w:fill="F5F5F5"/>
+          </w:tcPr>
+          <w:p>
+            <w:r>
+              <w:rPr>
+                <w:sz w:val="16"/>
+              </w:rPr>
+              <w:t>SCRAP-DISPUTES</w:t>
+            </w:r>
+          </w:p>
+        </w:tc>
+        <w:tc>
+          <w:tcPr>
+            <w:tcW w:type="dxa" w:w="1701"/>
+            <w:shd w:val="clear" w:color="auto" w:fill="F5F5F5"/>
+          </w:tcPr>
+          <w:p>
+            <w:r>
+              <w:rPr>
+                <w:sz w:val="16"/>
+              </w:rPr>
+              <w:t>A-10 /scrap/disputes/[id]</w:t>
+            </w:r>
+          </w:p>
+        </w:tc>
+        <w:tc>
+          <w:tcPr>
+            <w:tcW w:type="dxa" w:w="1587"/>
+            <w:shd w:val="clear" w:color="auto" w:fill="F5F5F5"/>
+          </w:tcPr>
+          <w:p>
+            <w:r>
+              <w:rPr>
+                <w:sz w:val="16"/>
+              </w:rPr>
+              <w:t>Admin</w:t>
+            </w:r>
+          </w:p>
+        </w:tc>
+        <w:tc>
+          <w:tcPr>
+            <w:tcW w:type="dxa" w:w="567"/>
+            <w:shd w:val="clear" w:color="auto" w:fill="F5F5F5"/>
+          </w:tcPr>
+          <w:p>
+            <w:r>
+              <w:rPr>
+                <w:sz w:val="16"/>
+              </w:rPr>
+              <w:t>S11</w:t>
+            </w:r>
+          </w:p>
+        </w:tc>
+        <w:tc>
+          <w:tcPr>
+            <w:tcW w:type="dxa" w:w="1814"/>
+            <w:shd w:val="clear" w:color="auto" w:fill="F5F5F5"/>
+          </w:tcPr>
+          <w:p>
+            <w:r>
+              <w:rPr>
+                <w:sz w:val="16"/>
+              </w:rPr>
+              <w:t>/scrap/disputes · S11 dispute list</w:t>
+            </w:r>
+          </w:p>
+        </w:tc>
+        <w:tc>
+          <w:tcPr>
+            <w:tcW w:type="dxa" w:w="3118"/>
+            <w:shd w:val="clear" w:color="auto" w:fill="F5F5F5"/>
+          </w:tcPr>
+          <w:p>
+            <w:r>
+              <w:rPr>
+                <w:sz w:val="16"/>
+              </w:rPr>
+              <w:t>http://localhost:3000/scrap/disputes</w:t>
+            </w:r>
+          </w:p>
+        </w:tc>
+      </w:tr>
+      <w:tr>
+        <w:tc>
+          <w:tcPr>
+            <w:tcW w:type="dxa" w:w="680"/>
+            <w:shd w:val="clear" w:color="auto" w:fill="F5F5F5"/>
+          </w:tcPr>
+          <w:p>
+            <w:r>
+              <w:rPr>
+                <w:sz w:val="16"/>
+              </w:rPr>
+              <w:t>A-10</w:t>
+            </w:r>
+          </w:p>
+        </w:tc>
+        <w:tc>
+          <w:tcPr>
+            <w:tcW w:type="dxa" w:w="1984"/>
+            <w:shd w:val="clear" w:color="auto" w:fill="F5F5F5"/>
+          </w:tcPr>
+          <w:p>
+            <w:r>
+              <w:rPr>
+                <w:sz w:val="16"/>
+              </w:rPr>
+              <w:t>Dispute Detail (Admin)</w:t>
+            </w:r>
+          </w:p>
+        </w:tc>
+        <w:tc>
+          <w:tcPr>
+            <w:tcW w:type="dxa" w:w="1701"/>
+            <w:shd w:val="clear" w:color="auto" w:fill="F5F5F5"/>
+          </w:tcPr>
+          <w:p>
+            <w:r>
+              <w:rPr>
+                <w:sz w:val="16"/>
+              </w:rPr>
+              <w:t>Admin</w:t>
+            </w:r>
+          </w:p>
+        </w:tc>
+        <w:tc>
+          <w:tcPr>
+            <w:tcW w:type="dxa" w:w="1984"/>
+            <w:shd w:val="clear" w:color="auto" w:fill="F5F5F5"/>
+          </w:tcPr>
+          <w:p>
+            <w:r>
+              <w:rPr>
+                <w:sz w:val="16"/>
+              </w:rPr>
+              <w:t>SCRAP-DISPUTE-DETAIL</w:t>
+            </w:r>
+          </w:p>
+        </w:tc>
+        <w:tc>
+          <w:tcPr>
+            <w:tcW w:type="dxa" w:w="1701"/>
+            <w:shd w:val="clear" w:color="auto" w:fill="F5F5F5"/>
+          </w:tcPr>
+          <w:p>
+            <w:r>
+              <w:rPr>
+                <w:sz w:val="16"/>
+              </w:rPr>
+              <w:t>A-09 /scrap/disputes</w:t>
+            </w:r>
+          </w:p>
+        </w:tc>
+        <w:tc>
+          <w:tcPr>
+            <w:tcW w:type="dxa" w:w="1587"/>
+            <w:shd w:val="clear" w:color="auto" w:fill="F5F5F5"/>
+          </w:tcPr>
+          <w:p>
+            <w:r>
+              <w:rPr>
+                <w:sz w:val="16"/>
+              </w:rPr>
+              <w:t>Admin · WeeeR · WeeeU</w:t>
+            </w:r>
+          </w:p>
+        </w:tc>
+        <w:tc>
+          <w:tcPr>
+            <w:tcW w:type="dxa" w:w="567"/>
+            <w:shd w:val="clear" w:color="auto" w:fill="F5F5F5"/>
+          </w:tcPr>
+          <w:p>
+            <w:r>
+              <w:rPr>
+                <w:sz w:val="16"/>
+              </w:rPr>
+              <w:t>S11</w:t>
+            </w:r>
+          </w:p>
+        </w:tc>
+        <w:tc>
+          <w:tcPr>
+            <w:tcW w:type="dxa" w:w="1814"/>
+            <w:shd w:val="clear" w:color="auto" w:fill="F5F5F5"/>
+          </w:tcPr>
+          <w:p>
+            <w:r>
+              <w:rPr>
+                <w:sz w:val="16"/>
+              </w:rPr>
+              <w:t>/scrap/disputes/[id] · S11 ตัดสิน</w:t>
+            </w:r>
+          </w:p>
+        </w:tc>
+        <w:tc>
+          <w:tcPr>
+            <w:tcW w:type="dxa" w:w="3118"/>
+            <w:shd w:val="clear" w:color="auto" w:fill="F5F5F5"/>
+          </w:tcPr>
+          <w:p>
+            <w:r>
+              <w:rPr>
+                <w:sz w:val="16"/>
+              </w:rPr>
+              <w:t>http://localhost:3000/scrap/disputes/D001</w:t>
+            </w:r>
+          </w:p>
+        </w:tc>
+      </w:tr>
+      <w:tr>
+        <w:tc>
+          <w:tcPr>
+            <w:tcW w:type="dxa" w:w="680"/>
+            <w:shd w:val="clear" w:color="auto" w:fill="F5F5F5"/>
+          </w:tcPr>
+          <w:p>
+            <w:r>
+              <w:rPr>
+                <w:sz w:val="16"/>
+              </w:rPr>
+              <w:t>A-11</w:t>
+            </w:r>
+          </w:p>
+        </w:tc>
+        <w:tc>
+          <w:tcPr>
+            <w:tcW w:type="dxa" w:w="1984"/>
+            <w:shd w:val="clear" w:color="auto" w:fill="F5F5F5"/>
+          </w:tcPr>
+          <w:p>
+            <w:r>
+              <w:rPr>
+                <w:sz w:val="16"/>
+              </w:rPr>
+              <w:t>E-Waste Certificates (Admin)</w:t>
+            </w:r>
+          </w:p>
+        </w:tc>
+        <w:tc>
+          <w:tcPr>
+            <w:tcW w:type="dxa" w:w="1701"/>
+            <w:shd w:val="clear" w:color="auto" w:fill="F5F5F5"/>
+          </w:tcPr>
+          <w:p>
+            <w:r>
+              <w:rPr>
+                <w:sz w:val="16"/>
+              </w:rPr>
+              <w:t>Admin</w:t>
+            </w:r>
+          </w:p>
+        </w:tc>
+        <w:tc>
+          <w:tcPr>
+            <w:tcW w:type="dxa" w:w="1984"/>
+            <w:shd w:val="clear" w:color="auto" w:fill="F5F5F5"/>
+          </w:tcPr>
+          <w:p>
+            <w:r>
+              <w:rPr>
+                <w:sz w:val="16"/>
+              </w:rPr>
+              <w:t>SCRAP-CERTS</w:t>
+            </w:r>
+          </w:p>
+        </w:tc>
+        <w:tc>
+          <w:tcPr>
+            <w:tcW w:type="dxa" w:w="1701"/>
+            <w:shd w:val="clear" w:color="auto" w:fill="F5F5F5"/>
+          </w:tcPr>
+          <w:p>
+            <w:r>
+              <w:rPr>
+                <w:sz w:val="16"/>
+              </w:rPr>
+              <w:t>A-11b /scrap/certificates/[id]</w:t>
+            </w:r>
+          </w:p>
+        </w:tc>
+        <w:tc>
+          <w:tcPr>
+            <w:tcW w:type="dxa" w:w="1587"/>
+            <w:shd w:val="clear" w:color="auto" w:fill="F5F5F5"/>
+          </w:tcPr>
+          <w:p>
+            <w:r>
+              <w:rPr>
+                <w:sz w:val="16"/>
+              </w:rPr>
+              <w:t>Admin · WeeeU</w:t>
+            </w:r>
+          </w:p>
+        </w:tc>
+        <w:tc>
+          <w:tcPr>
+            <w:tcW w:type="dxa" w:w="567"/>
+            <w:shd w:val="clear" w:color="auto" w:fill="F5F5F5"/>
+          </w:tcPr>
+          <w:p>
+            <w:r>
+              <w:rPr>
+                <w:sz w:val="16"/>
+              </w:rPr>
+              <w:t>S4</w:t>
+            </w:r>
+          </w:p>
+        </w:tc>
+        <w:tc>
+          <w:tcPr>
+            <w:tcW w:type="dxa" w:w="1814"/>
+            <w:shd w:val="clear" w:color="auto" w:fill="F5F5F5"/>
+          </w:tcPr>
+          <w:p>
+            <w:r>
+              <w:rPr>
+                <w:sz w:val="16"/>
+              </w:rPr>
+              <w:t>/scrap/certificates · S4 cert mgmt</w:t>
+            </w:r>
+          </w:p>
+        </w:tc>
+        <w:tc>
+          <w:tcPr>
+            <w:tcW w:type="dxa" w:w="3118"/>
+            <w:shd w:val="clear" w:color="auto" w:fill="F5F5F5"/>
+          </w:tcPr>
+          <w:p>
+            <w:r>
+              <w:rPr>
+                <w:sz w:val="16"/>
+              </w:rPr>
               <w:t>http://localhost:3000/scrap/certificates</w:t>
+            </w:r>
+          </w:p>
+        </w:tc>
+      </w:tr>
+      <w:tr>
+        <w:tc>
+          <w:tcPr>
+            <w:tcW w:type="dxa" w:w="680"/>
+            <w:shd w:val="clear" w:color="auto" w:fill="F5F5F5"/>
+          </w:tcPr>
+          <w:p>
+            <w:r>
+              <w:rPr>
+                <w:sz w:val="16"/>
+              </w:rPr>
+              <w:t>A-11b</w:t>
+            </w:r>
+          </w:p>
+        </w:tc>
+        <w:tc>
+          <w:tcPr>
+            <w:tcW w:type="dxa" w:w="1984"/>
+            <w:shd w:val="clear" w:color="auto" w:fill="F5F5F5"/>
+          </w:tcPr>
+          <w:p>
+            <w:r>
+              <w:rPr>
+                <w:sz w:val="16"/>
+              </w:rPr>
+              <w:t>E-Waste Cert Detail (Admin)</w:t>
+            </w:r>
+          </w:p>
+        </w:tc>
+        <w:tc>
+          <w:tcPr>
+            <w:tcW w:type="dxa" w:w="1701"/>
+            <w:shd w:val="clear" w:color="auto" w:fill="F5F5F5"/>
+          </w:tcPr>
+          <w:p>
+            <w:r>
+              <w:rPr>
+                <w:sz w:val="16"/>
+              </w:rPr>
+              <w:t>A-11 /scrap/certificates</w:t>
+            </w:r>
+          </w:p>
+        </w:tc>
+        <w:tc>
+          <w:tcPr>
+            <w:tcW w:type="dxa" w:w="1984"/>
+            <w:shd w:val="clear" w:color="auto" w:fill="F5F5F5"/>
+          </w:tcPr>
+          <w:p>
+            <w:r>
+              <w:rPr>
+                <w:sz w:val="16"/>
+              </w:rPr>
+              <w:t>SCRAP-CERT-DETAIL</w:t>
+            </w:r>
+          </w:p>
+        </w:tc>
+        <w:tc>
+          <w:tcPr>
+            <w:tcW w:type="dxa" w:w="1701"/>
+            <w:shd w:val="clear" w:color="auto" w:fill="F5F5F5"/>
+          </w:tcPr>
+          <w:p>
+            <w:r>
+              <w:rPr>
+                <w:sz w:val="16"/>
+              </w:rPr>
+              <w:t>— (ออก cert)</w:t>
+            </w:r>
+          </w:p>
+        </w:tc>
+        <w:tc>
+          <w:tcPr>
+            <w:tcW w:type="dxa" w:w="1587"/>
+            <w:shd w:val="clear" w:color="auto" w:fill="F5F5F5"/>
+          </w:tcPr>
+          <w:p>
+            <w:r>
+              <w:rPr>
+                <w:sz w:val="16"/>
+              </w:rPr>
+              <w:t>Admin</w:t>
+            </w:r>
+          </w:p>
+        </w:tc>
+        <w:tc>
+          <w:tcPr>
+            <w:tcW w:type="dxa" w:w="567"/>
+            <w:shd w:val="clear" w:color="auto" w:fill="F5F5F5"/>
+          </w:tcPr>
+          <w:p>
+            <w:r>
+              <w:rPr>
+                <w:sz w:val="16"/>
+              </w:rPr>
+              <w:t>S4</w:t>
+            </w:r>
+          </w:p>
+        </w:tc>
+        <w:tc>
+          <w:tcPr>
+            <w:tcW w:type="dxa" w:w="1814"/>
+            <w:shd w:val="clear" w:color="auto" w:fill="F5F5F5"/>
+          </w:tcPr>
+          <w:p>
+            <w:r>
+              <w:rPr>
+                <w:sz w:val="16"/>
+              </w:rPr>
+              <w:t>/scrap/certificates/[id] · A-11b detail</w:t>
+            </w:r>
+          </w:p>
+        </w:tc>
+        <w:tc>
+          <w:tcPr>
+            <w:tcW w:type="dxa" w:w="3118"/>
+            <w:shd w:val="clear" w:color="auto" w:fill="F5F5F5"/>
+          </w:tcPr>
+          <w:p>
+            <w:r>
+              <w:rPr>
+                <w:sz w:val="16"/>
+              </w:rPr>
+              <w:t>http://localhost:3000/scrap/certificates/EW-2026-001234</w:t>
+            </w:r>
+          </w:p>
+        </w:tc>
+      </w:tr>
+      <w:tr>
+        <w:tc>
+          <w:tcPr>
+            <w:tcW w:type="dxa" w:w="680"/>
+            <w:shd w:val="clear" w:color="auto" w:fill="F5F5F5"/>
+          </w:tcPr>
+          <w:p>
+            <w:r>
+              <w:rPr>
+                <w:sz w:val="16"/>
+              </w:rPr>
+              <w:t>A-33</w:t>
+            </w:r>
+          </w:p>
+        </w:tc>
+        <w:tc>
+          <w:tcPr>
+            <w:tcW w:type="dxa" w:w="1984"/>
+            <w:shd w:val="clear" w:color="auto" w:fill="F5F5F5"/>
+          </w:tcPr>
+          <w:p>
+            <w:r>
+              <w:rPr>
+                <w:sz w:val="16"/>
+              </w:rPr>
+              <w:t>จัดการประกาศซาก (Admin)</w:t>
+            </w:r>
+          </w:p>
+        </w:tc>
+        <w:tc>
+          <w:tcPr>
+            <w:tcW w:type="dxa" w:w="1701"/>
+            <w:shd w:val="clear" w:color="auto" w:fill="F5F5F5"/>
+          </w:tcPr>
+          <w:p>
+            <w:r>
+              <w:rPr>
+                <w:sz w:val="16"/>
+              </w:rPr>
+              <w:t>Admin sidebar</w:t>
+            </w:r>
+          </w:p>
+        </w:tc>
+        <w:tc>
+          <w:tcPr>
+            <w:tcW w:type="dxa" w:w="1984"/>
+            <w:shd w:val="clear" w:color="auto" w:fill="F5F5F5"/>
+          </w:tcPr>
+          <w:p>
+            <w:r>
+              <w:rPr>
+                <w:sz w:val="16"/>
+              </w:rPr>
+              <w:t>SCRAP-LISTINGS-ADMIN</w:t>
+            </w:r>
+          </w:p>
+        </w:tc>
+        <w:tc>
+          <w:tcPr>
+            <w:tcW w:type="dxa" w:w="1701"/>
+            <w:shd w:val="clear" w:color="auto" w:fill="F5F5F5"/>
+          </w:tcPr>
+          <w:p>
+            <w:r>
+              <w:rPr>
+                <w:sz w:val="16"/>
+              </w:rPr>
+              <w:t>A-33b /scrap/listings/[id]</w:t>
+            </w:r>
+          </w:p>
+        </w:tc>
+        <w:tc>
+          <w:tcPr>
+            <w:tcW w:type="dxa" w:w="1587"/>
+            <w:shd w:val="clear" w:color="auto" w:fill="F5F5F5"/>
+          </w:tcPr>
+          <w:p>
+            <w:r>
+              <w:rPr>
+                <w:sz w:val="16"/>
+              </w:rPr>
+              <w:t>Admin</w:t>
+            </w:r>
+          </w:p>
+        </w:tc>
+        <w:tc>
+          <w:tcPr>
+            <w:tcW w:type="dxa" w:w="567"/>
+            <w:shd w:val="clear" w:color="auto" w:fill="F5F5F5"/>
+          </w:tcPr>
+          <w:p>
+            <w:r>
+              <w:rPr>
+                <w:sz w:val="16"/>
+              </w:rPr>
+              <w:t>S1-S12</w:t>
+            </w:r>
+          </w:p>
+        </w:tc>
+        <w:tc>
+          <w:tcPr>
+            <w:tcW w:type="dxa" w:w="1814"/>
+            <w:shd w:val="clear" w:color="auto" w:fill="F5F5F5"/>
+          </w:tcPr>
+          <w:p>
+            <w:r>
+              <w:rPr>
+                <w:sz w:val="16"/>
+              </w:rPr>
+              <w:t>/scrap/listings · Admin ดูประกาศซากทั้งหมด</w:t>
+            </w:r>
+          </w:p>
+        </w:tc>
+        <w:tc>
+          <w:tcPr>
+            <w:tcW w:type="dxa" w:w="3118"/>
+            <w:shd w:val="clear" w:color="auto" w:fill="F5F5F5"/>
+          </w:tcPr>
+          <w:p>
+            <w:r>
+              <w:rPr>
+                <w:sz w:val="16"/>
+              </w:rPr>
+              <w:t>http://localhost:3000/scrap/listings</w:t>
+            </w:r>
+          </w:p>
+        </w:tc>
+      </w:tr>
+      <w:tr>
+        <w:tc>
+          <w:tcPr>
+            <w:tcW w:type="dxa" w:w="680"/>
+            <w:shd w:val="clear" w:color="auto" w:fill="F5F5F5"/>
+          </w:tcPr>
+          <w:p>
+            <w:r>
+              <w:rPr>
+                <w:sz w:val="16"/>
+              </w:rPr>
+              <w:t>A-33b</w:t>
+            </w:r>
+          </w:p>
+        </w:tc>
+        <w:tc>
+          <w:tcPr>
+            <w:tcW w:type="dxa" w:w="1984"/>
+            <w:shd w:val="clear" w:color="auto" w:fill="F5F5F5"/>
+          </w:tcPr>
+          <w:p>
+            <w:r>
+              <w:rPr>
+                <w:sz w:val="16"/>
+              </w:rPr>
+              <w:t>รายละเอียดประกาศซาก (Admin)</w:t>
+            </w:r>
+          </w:p>
+        </w:tc>
+        <w:tc>
+          <w:tcPr>
+            <w:tcW w:type="dxa" w:w="1701"/>
+            <w:shd w:val="clear" w:color="auto" w:fill="F5F5F5"/>
+          </w:tcPr>
+          <w:p>
+            <w:r>
+              <w:rPr>
+                <w:sz w:val="16"/>
+              </w:rPr>
+              <w:t>A-33 /scrap/listings</w:t>
+            </w:r>
+          </w:p>
+        </w:tc>
+        <w:tc>
+          <w:tcPr>
+            <w:tcW w:type="dxa" w:w="1984"/>
+            <w:shd w:val="clear" w:color="auto" w:fill="F5F5F5"/>
+          </w:tcPr>
+          <w:p>
+            <w:r>
+              <w:rPr>
+                <w:sz w:val="16"/>
+              </w:rPr>
+              <w:t>SCRAP-LISTING-DETAIL-ADMIN</w:t>
+            </w:r>
+          </w:p>
+        </w:tc>
+        <w:tc>
+          <w:tcPr>
+            <w:tcW w:type="dxa" w:w="1701"/>
+            <w:shd w:val="clear" w:color="auto" w:fill="F5F5F5"/>
+          </w:tcPr>
+          <w:p>
+            <w:r>
+              <w:rPr>
+                <w:sz w:val="16"/>
+              </w:rPr>
+              <w:t>A-33 /scrap/listings</w:t>
+            </w:r>
+          </w:p>
+        </w:tc>
+        <w:tc>
+          <w:tcPr>
+            <w:tcW w:type="dxa" w:w="1587"/>
+            <w:shd w:val="clear" w:color="auto" w:fill="F5F5F5"/>
+          </w:tcPr>
+          <w:p>
+            <w:r>
+              <w:rPr>
+                <w:sz w:val="16"/>
+              </w:rPr>
+              <w:t>Admin</w:t>
+            </w:r>
+          </w:p>
+        </w:tc>
+        <w:tc>
+          <w:tcPr>
+            <w:tcW w:type="dxa" w:w="567"/>
+            <w:shd w:val="clear" w:color="auto" w:fill="F5F5F5"/>
+          </w:tcPr>
+          <w:p>
+            <w:r>
+              <w:rPr>
+                <w:sz w:val="16"/>
+              </w:rPr>
+              <w:t>S1-S12</w:t>
+            </w:r>
+          </w:p>
+        </w:tc>
+        <w:tc>
+          <w:tcPr>
+            <w:tcW w:type="dxa" w:w="1814"/>
+            <w:shd w:val="clear" w:color="auto" w:fill="F5F5F5"/>
+          </w:tcPr>
+          <w:p>
+            <w:r>
+              <w:rPr>
+                <w:sz w:val="16"/>
+              </w:rPr>
+              <w:t>/scrap/listings/[id] · Admin listing detail</w:t>
+            </w:r>
+          </w:p>
+        </w:tc>
+        <w:tc>
+          <w:tcPr>
+            <w:tcW w:type="dxa" w:w="3118"/>
+            <w:shd w:val="clear" w:color="auto" w:fill="F5F5F5"/>
+          </w:tcPr>
+          <w:p>
+            <w:r>
+              <w:rPr>
+                <w:sz w:val="16"/>
+              </w:rPr>
+              <w:t>http://localhost:3000/scrap/listings/SCR-001</w:t>
             </w:r>
           </w:p>
         </w:tc>

</xml_diff>